<commit_message>
Refresh course materials: fix errors, stale info, spelling and grammar
- Fix factual errors (Feather M4 product/chip links and specs, oscilloscope
  sweep direction and velocity factor, Berea longitude, gravity units,
  Form 2 optical window, Inventor UI steps, traffic light colors)
- Make Python examples runnable: remove embedded line numbers, fix
  switchLED.py import, rename binkLED.py to blinkLED.py
- Update stale info: Mu retirement, Inventor disk/licensing, Azure
  Notebooks, nbextension, Matplotlib default colormap, Colab badges
- Add all eight sessions to the README
- Spelling and grammar fixes across markdown, notebooks, and Office files

Co-Authored-By: Claude Opus 5.5 <noreply@anthropic.com>
</commit_message>
<xml_diff>
--- a/Session04Soldering/SolderingBadge.docx
+++ b/Session04Soldering/SolderingBadge.docx
@@ -61,13 +61,13 @@
     <w:p/>
     <w:p>
       <w:r>
-        <w:t>This is a short guide on how to assemble the day of the geek badge.</w:t>
+        <w:t>This is a short guide on how to assemble the Day of the Geek badge.</w:t>
       </w:r>
     </w:p>
     <w:p/>
     <w:p>
       <w:r>
-        <w:t>First up you need to check that you have everything you need:</w:t>
+        <w:t>First up, you need to check that you have everything you need:</w:t>
       </w:r>
     </w:p>
     <w:p>
@@ -98,7 +98,7 @@
         </w:numPr>
       </w:pPr>
       <w:r>
-        <w:t>20mm Battery holder</w:t>
+        <w:t>20 mm battery holder</w:t>
       </w:r>
     </w:p>
     <w:p>
@@ -198,7 +198,7 @@
     </w:p>
     <w:p>
       <w:r>
-        <w:t>Place the battery holder into the provided holes and solder to the board, make sure you get this the correct way around! You need to be able to insert the battery from the bottom of the badge.</w:t>
+        <w:t>Place the battery holder into the provided holes and solder it to the board. Make sure you get this the correct way around! You need to be able to insert the battery from the bottom of the badge.</w:t>
       </w:r>
     </w:p>
     <w:p>
@@ -291,13 +291,13 @@
     </w:p>
     <w:p>
       <w:r>
-        <w:t xml:space="preserve">Using your pliers hold the pin back onto the </w:t>
+        <w:t xml:space="preserve">Using your pliers, hold the pin back onto the </w:t>
       </w:r>
       <w:r>
         <w:t>center</w:t>
       </w:r>
       <w:r>
-        <w:t xml:space="preserve"> of the pad you have just applied the solder to. While holding down with the pliers heat the pin back and hold the iron in place until you notice the solder flow to the edge.</w:t>
+        <w:t xml:space="preserve"> of the pad you have just applied the solder to. While holding it down with the pliers, heat the pin back and hold the iron in place until you notice the solder flow to the edge.</w:t>
       </w:r>
     </w:p>
     <w:p>
@@ -452,13 +452,12 @@
     </w:p>
     <w:p>
       <w:r>
-        <w:t>Using your cutters it's time to snip the legs from the LEDs. You should wear eye protection as the legs can fly off!</w:t>
-      </w:r>
-    </w:p>
-    <w:p>
-      <w:r>
-        <w:lastRenderedPageBreak/>
-        <w:t>If you want to have your badge stand up on a desk only snip the inner two legs and bend the remaining legs down slightly.</w:t>
+        <w:t>Using your cutters, it's time to snip the legs from the LEDs. You should wear eye protection as the legs can fly off!</w:t>
+      </w:r>
+    </w:p>
+    <w:p>
+      <w:r>
+        <w:t>If you want to have your badge stand up on a desk, only snip the inner two legs and bend the remaining legs down slightly.</w:t>
       </w:r>
     </w:p>
     <w:p>
@@ -472,7 +471,7 @@
     </w:p>
     <w:p>
       <w:r>
-        <w:t xml:space="preserve">Insert the battery writing side facing out and you are ready to augment your best threads with some Dia de </w:t>
+        <w:t xml:space="preserve">Insert the battery with the writing side facing out, and you are ready to augment your best threads with some Día de </w:t>
       </w:r>
       <w:proofErr w:type="spellStart"/>
       <w:r>

</xml_diff>